<commit_message>
Se agrego diagrama de arquitectura y tabla de ip (Closes #5)
</commit_message>
<xml_diff>
--- a/docs/arquitectura/Direccionamiento_IP.docx
+++ b/docs/arquitectura/Direccionamiento_IP.docx
@@ -138,11 +138,6 @@
           </mc:Fallback>
         </mc:AlternateContent>
       </w:r>
-      <w:r>
-        <w:rPr>
-          <w:lang w:val="es-MX"/>
-        </w:rPr>
-      </w:r>
     </w:p>
     <w:p>
       <w:pPr>
@@ -330,11 +325,6 @@
           </mc:Fallback>
         </mc:AlternateContent>
       </w:r>
-      <w:r>
-        <w:rPr>
-          <w:lang w:val="es-MX"/>
-        </w:rPr>
-      </w:r>
     </w:p>
     <w:p>
       <w:pPr>
@@ -576,18 +566,6 @@
           <w:lang w:val="es-MX"/>
         </w:rPr>
       </w:pPr>
-      <w:r>
-        <w:rPr>
-          <w:rFonts w:ascii="Calibri" w:hAnsi="Calibri" w:eastAsia="Calibri" w:cs="Calibri"/>
-          <w:b/>
-          <w:bCs/>
-          <w:color w:val="1f4e5f"/>
-          <w:sz w:val="26"/>
-          <w:szCs w:val="26"/>
-          <w:highlight w:val="none"/>
-          <w:lang w:val="es-MX" w:bidi="es-MX"/>
-        </w:rPr>
-      </w:r>
       <w:r>
         <w:rPr>
           <w:rFonts w:ascii="Calibri" w:hAnsi="Calibri" w:eastAsia="Calibri" w:cs="Calibri"/>
@@ -631,18 +609,6 @@
           <w:lang w:val="es-MX"/>
         </w:rPr>
       </w:pPr>
-      <w:r>
-        <w:rPr>
-          <w:rFonts w:ascii="Calibri" w:hAnsi="Calibri" w:eastAsia="Calibri" w:cs="Calibri"/>
-          <w:b/>
-          <w:bCs/>
-          <w:color w:val="1f4e5f"/>
-          <w:sz w:val="26"/>
-          <w:szCs w:val="26"/>
-          <w:highlight w:val="none"/>
-          <w:lang w:val="es-MX" w:bidi="es-MX"/>
-        </w:rPr>
-      </w:r>
       <w:r>
         <w:rPr>
           <w:rFonts w:ascii="Calibri" w:hAnsi="Calibri" w:eastAsia="Calibri" w:cs="Calibri"/>
@@ -1240,11 +1206,6 @@
       </w:r>
       <w:r>
         <w:rPr>
-          <w:lang w:val="es-MX" w:bidi="es-MX"/>
-        </w:rPr>
-      </w:r>
-      <w:r>
-        <w:rPr>
           <w:lang w:val="es-MX"/>
         </w:rPr>
       </w:r>
@@ -1258,11 +1219,6 @@
           <w:lang w:val="es-MX"/>
         </w:rPr>
       </w:pPr>
-      <w:r>
-        <w:rPr>
-          <w:lang w:val="es-MX" w:bidi="es-MX"/>
-        </w:rPr>
-      </w:r>
       <w:r>
         <w:rPr>
           <w:lang w:val="es-MX" w:bidi="es-MX"/>
@@ -2073,7 +2029,7 @@
                 <w:szCs w:val="20"/>
                 <w:lang w:val="es-MX"/>
               </w:rPr>
-              <w:t xml:space="preserve">192.168.100.20</w:t>
+              <w:t xml:space="preserve">192.168.100.11</w:t>
             </w:r>
             <w:r>
               <w:rPr>
@@ -2356,7 +2312,7 @@
                 <w:szCs w:val="20"/>
                 <w:lang w:val="es-MX"/>
               </w:rPr>
-              <w:t xml:space="preserve">192.168.100.30</w:t>
+              <w:t xml:space="preserve">192.168.100.12</w:t>
             </w:r>
             <w:r>
               <w:rPr>
@@ -2639,7 +2595,7 @@
                 <w:szCs w:val="20"/>
                 <w:lang w:val="es-MX"/>
               </w:rPr>
-              <w:t xml:space="preserve">192.168.100.40</w:t>
+              <w:t xml:space="preserve">192.168.100.30</w:t>
             </w:r>
             <w:r>
               <w:rPr>
@@ -2679,7 +2635,7 @@
                 <w:szCs w:val="20"/>
                 <w:lang w:val="es-MX"/>
               </w:rPr>
-              <w:t xml:space="preserve">5432 / 9000</w:t>
+              <w:t xml:space="preserve">5432 / 9000 / 9001</w:t>
             </w:r>
             <w:r>
               <w:rPr>
@@ -2786,11 +2742,6 @@
       </w:r>
       <w:r>
         <w:rPr>
-          <w:lang w:val="es-MX" w:bidi="es-MX"/>
-        </w:rPr>
-      </w:r>
-      <w:r>
-        <w:rPr>
           <w:lang w:val="es-MX"/>
         </w:rPr>
       </w:r>
@@ -2804,11 +2755,6 @@
           <w:lang w:val="es-MX"/>
         </w:rPr>
       </w:pPr>
-      <w:r>
-        <w:rPr>
-          <w:lang w:val="es-MX" w:bidi="es-MX"/>
-        </w:rPr>
-      </w:r>
       <w:r>
         <w:rPr>
           <w:lang w:val="es-MX" w:bidi="es-MX"/>
@@ -2836,11 +2782,6 @@
       </w:r>
       <w:r>
         <w:rPr>
-          <w:lang w:val="es-MX" w:bidi="es-MX"/>
-        </w:rPr>
-      </w:r>
-      <w:r>
-        <w:rPr>
           <w:lang w:val="es-MX"/>
         </w:rPr>
       </w:r>
@@ -2854,11 +2795,6 @@
           <w:lang w:val="es-MX"/>
         </w:rPr>
       </w:pPr>
-      <w:r>
-        <w:rPr>
-          <w:lang w:val="es-MX" w:bidi="es-MX"/>
-        </w:rPr>
-      </w:r>
       <w:r>
         <w:rPr>
           <w:lang w:val="es-MX" w:bidi="es-MX"/>
@@ -2879,11 +2815,6 @@
           <w:lang w:val="es-MX"/>
         </w:rPr>
       </w:pPr>
-      <w:r>
-        <w:rPr>
-          <w:lang w:val="es-MX" w:bidi="es-MX"/>
-        </w:rPr>
-      </w:r>
       <w:r>
         <w:rPr>
           <w:lang w:val="es-MX" w:bidi="es-MX"/>
@@ -4127,11 +4058,6 @@
       </w:r>
       <w:r>
         <w:rPr>
-          <w:lang w:val="es-MX" w:bidi="es-MX"/>
-        </w:rPr>
-      </w:r>
-      <w:r>
-        <w:rPr>
           <w:lang w:val="es-MX"/>
         </w:rPr>
       </w:r>
@@ -4145,11 +4071,6 @@
           <w:lang w:val="es-MX"/>
         </w:rPr>
       </w:pPr>
-      <w:r>
-        <w:rPr>
-          <w:lang w:val="es-MX" w:bidi="es-MX"/>
-        </w:rPr>
-      </w:r>
       <w:r>
         <w:rPr>
           <w:lang w:val="es-MX" w:bidi="es-MX"/>

</xml_diff>